<commit_message>
feat: route demo JSON through canary viewer
</commit_message>
<xml_diff>
--- a/public/downloads/cloudflare-application-security-speaker-notes.docx
+++ b/public/downloads/cloudflare-application-security-speaker-notes.docx
@@ -6131,7 +6131,7 @@
         <w:rPr>
           <w:rFonts w:ascii="Calibri" w:hAnsi="Calibri"/>
         </w:rPr>
-        <w:t xml:space="preserve"> Show intended API inventory, live endpoint behavior, redaction, plan boundaries, and a real 200→429 edge enforcement loop.</w:t>
+        <w:t xml:space="preserve"> Show intended API inventory, live endpoint behavior, redaction, a highlighted Cloudflare control graph, plan boundaries, and a real 200→429 edge enforcement loop.</w:t>
       </w:r>
     </w:p>
     <w:p>
@@ -6159,6 +6159,28 @@
           <w:rFonts w:ascii="Calibri" w:hAnsi="Calibri"/>
         </w:rPr>
         <w:t>“This inventory has eight declared operations. I can execute each public GET operation from the slide and see the HTTP status, Ray ID, and public-safe JSON. The request-inspection endpoint proves the Worker saw the hostname, path, protocol, TLS, and colo while intentionally excluding IP addresses, cookies, credentials, and bodies.”</w:t>
+      </w:r>
+    </w:p>
+    <w:p>
+      <w:r>
+        <w:rPr>
+          <w:rFonts w:ascii="Calibri" w:hAnsi="Calibri"/>
+        </w:rPr>
+        <w:t xml:space="preserve">“The canary link sends the live </w:t>
+      </w:r>
+      <w:r>
+        <w:rPr>
+          <w:rFonts w:ascii="Consolas" w:hAnsi="Consolas"/>
+          <w:color w:val="1F4D78"/>
+          <w:sz w:val="19"/>
+        </w:rPr>
+        <w:t>/api/security-controls</w:t>
+      </w:r>
+      <w:r>
+        <w:rPr>
+          <w:rFonts w:ascii="Calibri" w:hAnsi="Calibri"/>
+        </w:rPr>
+        <w:t xml:space="preserve"> response into PlatPhorm JSON on Cloudflare. It opens a guided Graph view that steps through WAF, bot controls, managed API endpoints, and rate limiting, then returns directly to this slide. Every successful GET in the API explorer also exposes the same full-response handoff. The graph is fetched from this Worker at presentation time; it is not a fabricated screenshot.”</w:t>
       </w:r>
     </w:p>
     <w:p>
@@ -6229,7 +6251,7 @@
           <w:color w:val="1F4D78"/>
           <w:sz w:val="19"/>
         </w:rPr>
-        <w:t>/api/demo/preflight</w:t>
+        <w:t>/api/security-controls</w:t>
       </w:r>
     </w:p>
     <w:p>
@@ -6243,11 +6265,23 @@
       </w:pPr>
       <w:r>
         <w:rPr>
-          <w:rFonts w:ascii="Consolas" w:hAnsi="Consolas"/>
-          <w:color w:val="1F4D78"/>
-          <w:sz w:val="19"/>
-        </w:rPr>
-        <w:t>/api/demo/request-inspection</w:t>
+          <w:rFonts w:ascii="Calibri" w:hAnsi="Calibri"/>
+        </w:rPr>
+        <w:t xml:space="preserve">Select </w:t>
+      </w:r>
+      <w:r>
+        <w:rPr>
+          <w:rFonts w:ascii="Calibri" w:hAnsi="Calibri"/>
+          <w:b/>
+          <w:color w:val="0B2545"/>
+        </w:rPr>
+        <w:t>Open the highlighted control graph</w:t>
+      </w:r>
+      <w:r>
+        <w:rPr>
+          <w:rFonts w:ascii="Calibri" w:hAnsi="Calibri"/>
+        </w:rPr>
+        <w:t xml:space="preserve"> and point out the four color-coded control paths.</w:t>
       </w:r>
     </w:p>
     <w:p>
@@ -6263,21 +6297,35 @@
         <w:rPr>
           <w:rFonts w:ascii="Calibri" w:hAnsi="Calibri"/>
         </w:rPr>
-        <w:t xml:space="preserve">Select </w:t>
-      </w:r>
-      <w:r>
-        <w:rPr>
-          <w:rFonts w:ascii="Calibri" w:hAnsi="Calibri"/>
-          <w:b/>
-          <w:color w:val="0B2545"/>
-        </w:rPr>
-        <w:t>Run controlled burst</w:t>
-      </w:r>
-      <w:r>
-        <w:rPr>
-          <w:rFonts w:ascii="Calibri" w:hAnsi="Calibri"/>
-        </w:rPr>
-        <w:t xml:space="preserve"> and narrate the allowed count, wait state, and first 429.</w:t>
+        <w:t xml:space="preserve">Return to the deck, then run </w:t>
+      </w:r>
+      <w:r>
+        <w:rPr>
+          <w:rFonts w:ascii="Consolas" w:hAnsi="Consolas"/>
+          <w:color w:val="1F4D78"/>
+          <w:sz w:val="19"/>
+        </w:rPr>
+        <w:t>/api/demo/preflight</w:t>
+      </w:r>
+      <w:r>
+        <w:rPr>
+          <w:rFonts w:ascii="Calibri" w:hAnsi="Calibri"/>
+        </w:rPr>
+        <w:t xml:space="preserve"> and </w:t>
+      </w:r>
+      <w:r>
+        <w:rPr>
+          <w:rFonts w:ascii="Consolas" w:hAnsi="Consolas"/>
+          <w:color w:val="1F4D78"/>
+          <w:sz w:val="19"/>
+        </w:rPr>
+        <w:t>/api/demo/request-inspection</w:t>
+      </w:r>
+      <w:r>
+        <w:rPr>
+          <w:rFonts w:ascii="Calibri" w:hAnsi="Calibri"/>
+        </w:rPr>
+        <w:t>.</w:t>
       </w:r>
     </w:p>
     <w:p>
@@ -6293,6 +6341,36 @@
         <w:rPr>
           <w:rFonts w:ascii="Calibri" w:hAnsi="Calibri"/>
         </w:rPr>
+        <w:t xml:space="preserve">Select </w:t>
+      </w:r>
+      <w:r>
+        <w:rPr>
+          <w:rFonts w:ascii="Calibri" w:hAnsi="Calibri"/>
+          <w:b/>
+          <w:color w:val="0B2545"/>
+        </w:rPr>
+        <w:t>Run controlled burst</w:t>
+      </w:r>
+      <w:r>
+        <w:rPr>
+          <w:rFonts w:ascii="Calibri" w:hAnsi="Calibri"/>
+        </w:rPr>
+        <w:t xml:space="preserve"> and narrate the allowed count, wait state, and first 429.</w:t>
+      </w:r>
+    </w:p>
+    <w:p>
+      <w:pPr>
+        <w:numPr>
+          <w:ilvl w:val="0"/>
+          <w:numId w:val="38"/>
+        </w:numPr>
+        <w:spacing w:before="0" w:after="80" w:line="300" w:lineRule="auto"/>
+        <w:ind w:left="540" w:hanging="271"/>
+      </w:pPr>
+      <w:r>
+        <w:rPr>
+          <w:rFonts w:ascii="Calibri" w:hAnsi="Calibri"/>
+        </w:rPr>
         <w:t xml:space="preserve">Open </w:t>
       </w:r>
       <w:r>
@@ -6383,6 +6461,36 @@
           <w:rFonts w:ascii="Calibri" w:hAnsi="Calibri"/>
         </w:rPr>
         <w:t>OpenAPI document linked from the slide.</w:t>
+      </w:r>
+    </w:p>
+    <w:p>
+      <w:pPr>
+        <w:numPr>
+          <w:ilvl w:val="0"/>
+          <w:numId w:val="39"/>
+        </w:numPr>
+        <w:spacing w:before="0" w:after="80" w:line="300" w:lineRule="auto"/>
+        <w:ind w:left="540" w:hanging="271"/>
+      </w:pPr>
+      <w:r>
+        <w:rPr>
+          <w:rFonts w:ascii="Calibri" w:hAnsi="Calibri"/>
+        </w:rPr>
+        <w:t xml:space="preserve">Live PlatPhorm JSON canary graph sourced from </w:t>
+      </w:r>
+      <w:r>
+        <w:rPr>
+          <w:rFonts w:ascii="Consolas" w:hAnsi="Consolas"/>
+          <w:color w:val="1F4D78"/>
+          <w:sz w:val="19"/>
+        </w:rPr>
+        <w:t>/api/security-controls</w:t>
+      </w:r>
+      <w:r>
+        <w:rPr>
+          <w:rFonts w:ascii="Calibri" w:hAnsi="Calibri"/>
+        </w:rPr>
+        <w:t>, with WAF, bot, API, and rate-limit highlighting.</w:t>
       </w:r>
     </w:p>
     <w:p>

</xml_diff>

<commit_message>
docs(cloudflare): add browser game impact case study
</commit_message>
<xml_diff>
--- a/public/downloads/cloudflare-application-security-speaker-notes.docx
+++ b/public/downloads/cloudflare-application-security-speaker-notes.docx
@@ -8607,6 +8607,509 @@
             <w:u w:val="single"/>
           </w:rPr>
           <w:t>https://developers.cloudflare.com/browser-run/get-started/</w:t>
+        </w:r>
+      </w:hyperlink>
+    </w:p>
+    <w:p>
+      <w:pPr>
+        <w:pStyle w:val="Heading1"/>
+        <w:pageBreakBefore/>
+      </w:pPr>
+      <w:r>
+        <w:rPr>
+          <w:rFonts w:ascii="Calibri" w:hAnsi="Calibri"/>
+        </w:rPr>
+        <w:t>Impact use case — secure browser multiplayer on one Cloudflare perimeter</w:t>
+      </w:r>
+    </w:p>
+    <w:p>
+      <w:r>
+        <w:rPr>
+          <w:rFonts w:ascii="Calibri" w:hAnsi="Calibri"/>
+          <w:b/>
+          <w:color w:val="0B2545"/>
+        </w:rPr>
+        <w:t>Customer scenario:</w:t>
+      </w:r>
+      <w:r>
+        <w:rPr>
+          <w:rFonts w:ascii="Calibri" w:hAnsi="Calibri"/>
+        </w:rPr>
+        <w:t xml:space="preserve"> A startup game studio has migrated a browser-native multiplayer arena from a split AWS, Redis and Vercel-style path to Cloudflare. It expects future interoperability with a high-scale external online ecosystem such as GTA6 Online, but makes no claim of Rockstar affiliation, endorsement, API access or current integration.</w:t>
+      </w:r>
+    </w:p>
+    <w:p>
+      <w:r>
+        <w:rPr>
+          <w:rFonts w:ascii="Calibri" w:hAnsi="Calibri"/>
+          <w:b/>
+          <w:color w:val="0B2545"/>
+        </w:rPr>
+        <w:t>Customer outcome:</w:t>
+      </w:r>
+      <w:r>
+        <w:rPr>
+          <w:rFonts w:ascii="Calibri" w:hAnsi="Calibri"/>
+        </w:rPr>
+        <w:t xml:space="preserve"> Preserve simulation and graphics fidelity while reducing release-mixing, asset-pop-in, room divergence, attack surface and cross-provider latency. Every control must improve or leave gameplay unchanged; nothing optional may enter the authoritative input, tick, hit, pickup or score path.</w:t>
+      </w:r>
+    </w:p>
+    <w:p>
+      <w:pPr>
+        <w:pStyle w:val="Heading2"/>
+      </w:pPr>
+      <w:r>
+        <w:rPr>
+          <w:rFonts w:ascii="Calibri" w:hAnsi="Calibri"/>
+        </w:rPr>
+        <w:t>What is live and proven</w:t>
+      </w:r>
+    </w:p>
+    <w:p>
+      <w:pPr>
+        <w:numPr>
+          <w:ilvl w:val="0"/>
+          <w:numId w:val="44"/>
+        </w:numPr>
+        <w:spacing w:before="0" w:after="80" w:line="300" w:lineRule="auto"/>
+        <w:ind w:left="540" w:hanging="271"/>
+      </w:pPr>
+      <w:r>
+        <w:rPr>
+          <w:rFonts w:ascii="Calibri" w:hAnsi="Calibri"/>
+        </w:rPr>
+        <w:t>Cloudflare authoritative DNS, anycast TLS, DDoS protection and WAF protect the canonical game hostname.</w:t>
+      </w:r>
+    </w:p>
+    <w:p>
+      <w:pPr>
+        <w:numPr>
+          <w:ilvl w:val="0"/>
+          <w:numId w:val="44"/>
+        </w:numPr>
+        <w:spacing w:before="0" w:after="80" w:line="300" w:lineRule="auto"/>
+        <w:ind w:left="540" w:hanging="271"/>
+      </w:pPr>
+      <w:r>
+        <w:rPr>
+          <w:rFonts w:ascii="Calibri" w:hAnsi="Calibri"/>
+        </w:rPr>
+        <w:t>Workers Assets serves the application shell; the dedicated multiplayer Worker routes same-origin WebSockets to one SQLite Durable Object per room.</w:t>
+      </w:r>
+    </w:p>
+    <w:p>
+      <w:pPr>
+        <w:numPr>
+          <w:ilvl w:val="0"/>
+          <w:numId w:val="44"/>
+        </w:numPr>
+        <w:spacing w:before="0" w:after="80" w:line="300" w:lineRule="auto"/>
+        <w:ind w:left="540" w:hanging="271"/>
+      </w:pPr>
+      <w:r>
+        <w:rPr>
+          <w:rFonts w:ascii="Calibri" w:hAnsi="Calibri"/>
+        </w:rPr>
+        <w:t>R2 serves deterministic runtime releases with byte ranges, SHA-256 ETags and immutable edge caching. Workers KV holds only the verified current-release pointer; it never owns match state.</w:t>
+      </w:r>
+    </w:p>
+    <w:p>
+      <w:pPr>
+        <w:numPr>
+          <w:ilvl w:val="0"/>
+          <w:numId w:val="44"/>
+        </w:numPr>
+        <w:spacing w:before="0" w:after="80" w:line="300" w:lineRule="auto"/>
+        <w:ind w:left="540" w:hanging="271"/>
+      </w:pPr>
+      <w:r>
+        <w:rPr>
+          <w:rFonts w:ascii="Calibri" w:hAnsi="Calibri"/>
+        </w:rPr>
+        <w:t>D1 stores results, moderation and stewardship receipts. Cron, Queues and a DLQ maintain persistent joinable-room definitions asynchronously and never run the game loop.</w:t>
+      </w:r>
+    </w:p>
+    <w:p>
+      <w:pPr>
+        <w:numPr>
+          <w:ilvl w:val="0"/>
+          <w:numId w:val="44"/>
+        </w:numPr>
+        <w:spacing w:before="0" w:after="80" w:line="300" w:lineRule="auto"/>
+        <w:ind w:left="540" w:hanging="271"/>
+      </w:pPr>
+      <w:r>
+        <w:rPr>
+          <w:rFonts w:ascii="Calibri" w:hAnsi="Calibri"/>
+        </w:rPr>
+        <w:t>Workers AI is reachable only through a private service binding for bounded post-match coaching.</w:t>
+      </w:r>
+    </w:p>
+    <w:p>
+      <w:pPr>
+        <w:numPr>
+          <w:ilvl w:val="0"/>
+          <w:numId w:val="44"/>
+        </w:numPr>
+        <w:spacing w:before="0" w:after="80" w:line="300" w:lineRule="auto"/>
+        <w:ind w:left="540" w:hanging="271"/>
+      </w:pPr>
+      <w:r>
+        <w:rPr>
+          <w:rFonts w:ascii="Calibri" w:hAnsi="Calibri"/>
+        </w:rPr>
+        <w:t>Web Analytics RUM and Log Explorer provide passive player and edge evidence without delaying gameplay.</w:t>
+      </w:r>
+    </w:p>
+    <w:p>
+      <w:pPr>
+        <w:numPr>
+          <w:ilvl w:val="0"/>
+          <w:numId w:val="44"/>
+        </w:numPr>
+        <w:spacing w:before="0" w:after="80" w:line="300" w:lineRule="auto"/>
+        <w:ind w:left="540" w:hanging="271"/>
+      </w:pPr>
+      <w:r>
+        <w:rPr>
+          <w:rFonts w:ascii="Calibri" w:hAnsi="Calibri"/>
+        </w:rPr>
+        <w:t>The final live gates passed: 60/60 OWASP-aligned probes, 1/1 two-human state convergence, 2/2 mobile landscape engines, 3/3 regional HTTPS/TLS checks, and a six-minute production tournament with seven bots, 70 bot-on-bot attacks and 11 frags.</w:t>
+      </w:r>
+    </w:p>
+    <w:p>
+      <w:pPr>
+        <w:numPr>
+          <w:ilvl w:val="0"/>
+          <w:numId w:val="44"/>
+        </w:numPr>
+        <w:spacing w:before="0" w:after="80" w:line="300" w:lineRule="auto"/>
+        <w:ind w:left="540" w:hanging="271"/>
+      </w:pPr>
+      <w:r>
+        <w:rPr>
+          <w:rFonts w:ascii="Calibri" w:hAnsi="Calibri"/>
+        </w:rPr>
+        <w:t>The deterministic release contract passed 264 suites and 1,434 tests; the integrity scan covered 304 test files.</w:t>
+      </w:r>
+    </w:p>
+    <w:p>
+      <w:pPr>
+        <w:pStyle w:val="Heading2"/>
+      </w:pPr>
+      <w:r>
+        <w:rPr>
+          <w:rFonts w:ascii="Calibri" w:hAnsi="Calibri"/>
+        </w:rPr>
+        <w:t>Before and after performance evidence</w:t>
+      </w:r>
+    </w:p>
+    <w:p>
+      <w:r>
+        <w:rPr>
+          <w:rFonts w:ascii="Calibri" w:hAnsi="Calibri"/>
+        </w:rPr>
+        <w:t>Seven matched samples compare the legacy hostname with the canonical Cloudflare hostname. Home-page median TTFB improved from 165.08 ms to 150.27 ms, an 8.97% reduction. Median total time improved from 188.98 ms to 175.98 ms, a 6.88% reduction. The exact 2,789,505-byte PK3 asset improved from 123.19 ms to 119.70 ms median TTFB and from 404.54 ms to 383.76 ms median total time; measured throughput increased 5.42%.</w:t>
+      </w:r>
+    </w:p>
+    <w:p>
+      <w:r>
+        <w:rPr>
+          <w:rFonts w:ascii="Calibri" w:hAnsi="Calibri"/>
+        </w:rPr>
+        <w:t>Do not overstate the result. One home-page p95 connection outlier remains, and the population RUM window is still accumulating. Deep health endpoint timings are control-plane diagnostics, not gameplay latency.</w:t>
+      </w:r>
+    </w:p>
+    <w:p>
+      <w:pPr>
+        <w:pStyle w:val="Heading2"/>
+      </w:pPr>
+      <w:r>
+        <w:rPr>
+          <w:rFonts w:ascii="Calibri" w:hAnsi="Calibri"/>
+        </w:rPr>
+        <w:t>Architecture boundary to narrate</w:t>
+      </w:r>
+    </w:p>
+    <w:p>
+      <w:pPr>
+        <w:spacing w:before="120" w:after="80"/>
+        <w:jc w:val="center"/>
+      </w:pPr>
+      <w:r>
+        <w:drawing>
+          <wp:inline xmlns:a="http://schemas.openxmlformats.org/drawingml/2006/main" xmlns:pic="http://schemas.openxmlformats.org/drawingml/2006/picture">
+            <wp:extent cx="5852160" cy="4401389"/>
+            <wp:docPr id="1" name="Picture 1"/>
+            <wp:cNvGraphicFramePr>
+              <a:graphicFrameLocks noChangeAspect="1"/>
+            </wp:cNvGraphicFramePr>
+            <a:graphic>
+              <a:graphicData uri="http://schemas.openxmlformats.org/drawingml/2006/picture">
+                <pic:pic>
+                  <pic:nvPicPr>
+                    <pic:cNvPr id="0" name="cloudflare-fullstack-game-next-release.png"/>
+                    <pic:cNvPicPr/>
+                  </pic:nvPicPr>
+                  <pic:blipFill>
+                    <a:blip r:embed="rId30"/>
+                    <a:stretch>
+                      <a:fillRect/>
+                    </a:stretch>
+                  </pic:blipFill>
+                  <pic:spPr>
+                    <a:xfrm>
+                      <a:off x="0" y="0"/>
+                      <a:ext cx="5852160" cy="4401389"/>
+                    </a:xfrm>
+                    <a:prstGeom prst="rect"/>
+                  </pic:spPr>
+                </pic:pic>
+              </a:graphicData>
+            </a:graphic>
+          </wp:inline>
+        </w:drawing>
+      </w:r>
+    </w:p>
+    <w:p>
+      <w:pPr>
+        <w:spacing w:after="180"/>
+        <w:jc w:val="center"/>
+      </w:pPr>
+      <w:r>
+        <w:rPr>
+          <w:rFonts w:ascii="Calibri" w:hAnsi="Calibri"/>
+          <w:i/>
+          <w:color w:val="66736A"/>
+          <w:sz w:val="17"/>
+        </w:rPr>
+        <w:t>QuakeCraft next-release full-stack Cloudflare architecture. The authoritative WebSocket room path is isolated from assets, durable records, AI/search, analytics, media and studio-only Zero Trust controls.</w:t>
+      </w:r>
+    </w:p>
+    <w:p>
+      <w:r>
+        <w:rPr>
+          <w:rFonts w:ascii="Calibri" w:hAnsi="Calibri"/>
+        </w:rPr>
+        <w:t>The hot path is deliberately small: browser, edge security/delivery, the dedicated multiplayer Worker and one room Durable Object. R2, KV, D1, Queues, Workers AI, Vectorize, AI Search, media services and Zero Trust policy cannot determine a hit, pickup, movement state, timer, arena revision or winner.</w:t>
+      </w:r>
+    </w:p>
+    <w:p>
+      <w:pPr>
+        <w:pStyle w:val="Heading2"/>
+      </w:pPr>
+      <w:r>
+        <w:rPr>
+          <w:rFonts w:ascii="Calibri" w:hAnsi="Calibri"/>
+        </w:rPr>
+        <w:t>Next-release gates, not deployment claims</w:t>
+      </w:r>
+    </w:p>
+    <w:p>
+      <w:pPr>
+        <w:numPr>
+          <w:ilvl w:val="0"/>
+          <w:numId w:val="45"/>
+        </w:numPr>
+        <w:spacing w:before="0" w:after="80" w:line="300" w:lineRule="auto"/>
+        <w:ind w:left="540" w:hanging="271"/>
+      </w:pPr>
+      <w:r>
+        <w:rPr>
+          <w:rFonts w:ascii="Calibri" w:hAnsi="Calibri"/>
+        </w:rPr>
+        <w:t>Vectorize and AI Search are approved only for a public-safe, source-cited corpus of maps, rules, release notes and runbooks. They are not provisioned until corpus, citation and privacy tests pass.</w:t>
+      </w:r>
+    </w:p>
+    <w:p>
+      <w:pPr>
+        <w:numPr>
+          <w:ilvl w:val="0"/>
+          <w:numId w:val="45"/>
+        </w:numPr>
+        <w:spacing w:before="0" w:after="80" w:line="300" w:lineRule="auto"/>
+        <w:ind w:left="540" w:hanging="271"/>
+      </w:pPr>
+      <w:r>
+        <w:rPr>
+          <w:rFonts w:ascii="Calibri" w:hAnsi="Calibri"/>
+        </w:rPr>
+        <w:t>Realtime SFU and TURN are limited to explicit opt-in voice. Match identity and room authority remain in Durable Objects even if media fails.</w:t>
+      </w:r>
+    </w:p>
+    <w:p>
+      <w:pPr>
+        <w:numPr>
+          <w:ilvl w:val="0"/>
+          <w:numId w:val="45"/>
+        </w:numPr>
+        <w:spacing w:before="0" w:after="80" w:line="300" w:lineRule="auto"/>
+        <w:ind w:left="540" w:hanging="271"/>
+      </w:pPr>
+      <w:r>
+        <w:rPr>
+          <w:rFonts w:ascii="Calibri" w:hAnsi="Calibri"/>
+        </w:rPr>
+        <w:t>Pipelines, R2 Data Catalog and Stream remain asynchronous analytics, spectator or replay planes.</w:t>
+      </w:r>
+    </w:p>
+    <w:p>
+      <w:pPr>
+        <w:numPr>
+          <w:ilvl w:val="0"/>
+          <w:numId w:val="45"/>
+        </w:numPr>
+        <w:spacing w:before="0" w:after="80" w:line="300" w:lineRule="auto"/>
+        <w:ind w:left="540" w:hanging="271"/>
+      </w:pPr>
+      <w:r>
+        <w:rPr>
+          <w:rFonts w:ascii="Calibri" w:hAnsi="Calibri"/>
+        </w:rPr>
+        <w:t>Cloudflare One DNS policies protect enrolled studio and CI device egress only. They do not replace public authoritative DNS, CDN routing or player-path controls and require a canary plus policy-precedence audit before enablement.</w:t>
+      </w:r>
+    </w:p>
+    <w:p>
+      <w:pPr>
+        <w:pStyle w:val="Heading2"/>
+      </w:pPr>
+      <w:r>
+        <w:rPr>
+          <w:rFonts w:ascii="Calibri" w:hAnsi="Calibri"/>
+        </w:rPr>
+        <w:t>Presenter close</w:t>
+      </w:r>
+    </w:p>
+    <w:p>
+      <w:r>
+        <w:rPr>
+          <w:rFonts w:ascii="Calibri" w:hAnsi="Calibri"/>
+        </w:rPr>
+        <w:t>“This case study shows why layered application security is an architecture decision, not a collection of checkboxes. The security perimeter, application delivery and room authority are co-located at the Cloudflare edge, while assets, records, AI, analytics and media remain isolated by failure model. The proof is not the diagram: it is the passing live multiplayer, mobile, security, asset-integrity and deterministic release evidence behind it.”</w:t>
+      </w:r>
+    </w:p>
+    <w:p>
+      <w:pPr>
+        <w:numPr>
+          <w:ilvl w:val="0"/>
+          <w:numId w:val="46"/>
+        </w:numPr>
+        <w:spacing w:before="0" w:after="80" w:line="300" w:lineRule="auto"/>
+        <w:ind w:left="540" w:hanging="271"/>
+      </w:pPr>
+      <w:r>
+        <w:rPr>
+          <w:rFonts w:ascii="Calibri" w:hAnsi="Calibri"/>
+        </w:rPr>
+        <w:t xml:space="preserve">Full-stack serverless reference architecture: </w:t>
+      </w:r>
+      <w:hyperlink r:id="rId31">
+        <w:r>
+          <w:rPr>
+            <w:color w:val="2E74B5"/>
+            <w:u w:val="single"/>
+          </w:rPr>
+          <w:t>https://developers.cloudflare.com/reference-architecture/diagrams/serverless/fullstack-application/</w:t>
+        </w:r>
+      </w:hyperlink>
+    </w:p>
+    <w:p>
+      <w:pPr>
+        <w:numPr>
+          <w:ilvl w:val="0"/>
+          <w:numId w:val="46"/>
+        </w:numPr>
+        <w:spacing w:before="0" w:after="80" w:line="300" w:lineRule="auto"/>
+        <w:ind w:left="540" w:hanging="271"/>
+      </w:pPr>
+      <w:r>
+        <w:rPr>
+          <w:rFonts w:ascii="Calibri" w:hAnsi="Calibri"/>
+        </w:rPr>
+        <w:t xml:space="preserve">Workers static assets: </w:t>
+      </w:r>
+      <w:hyperlink r:id="rId32">
+        <w:r>
+          <w:rPr>
+            <w:color w:val="2E74B5"/>
+            <w:u w:val="single"/>
+          </w:rPr>
+          <w:t>https://developers.cloudflare.com/workers/static-assets/</w:t>
+        </w:r>
+      </w:hyperlink>
+    </w:p>
+    <w:p>
+      <w:pPr>
+        <w:numPr>
+          <w:ilvl w:val="0"/>
+          <w:numId w:val="46"/>
+        </w:numPr>
+        <w:spacing w:before="0" w:after="80" w:line="300" w:lineRule="auto"/>
+        <w:ind w:left="540" w:hanging="271"/>
+      </w:pPr>
+      <w:r>
+        <w:rPr>
+          <w:rFonts w:ascii="Calibri" w:hAnsi="Calibri"/>
+        </w:rPr>
+        <w:t xml:space="preserve">R2 Data Catalog getting started: </w:t>
+      </w:r>
+      <w:hyperlink r:id="rId33">
+        <w:r>
+          <w:rPr>
+            <w:color w:val="2E74B5"/>
+            <w:u w:val="single"/>
+          </w:rPr>
+          <w:t>https://developers.cloudflare.com/r2/data-catalog/get-started/</w:t>
+        </w:r>
+      </w:hyperlink>
+    </w:p>
+    <w:p>
+      <w:pPr>
+        <w:numPr>
+          <w:ilvl w:val="0"/>
+          <w:numId w:val="46"/>
+        </w:numPr>
+        <w:spacing w:before="0" w:after="80" w:line="300" w:lineRule="auto"/>
+        <w:ind w:left="540" w:hanging="271"/>
+      </w:pPr>
+      <w:r>
+        <w:rPr>
+          <w:rFonts w:ascii="Calibri" w:hAnsi="Calibri"/>
+        </w:rPr>
+        <w:t xml:space="preserve">Cloudflare Log Explorer fields: </w:t>
+      </w:r>
+      <w:hyperlink r:id="rId34">
+        <w:r>
+          <w:rPr>
+            <w:color w:val="2E74B5"/>
+            <w:u w:val="single"/>
+          </w:rPr>
+          <w:t>https://developers.cloudflare.com/logs/logpush/logpush-job/datasets/zone/http_requests/</w:t>
+        </w:r>
+      </w:hyperlink>
+    </w:p>
+    <w:p>
+      <w:pPr>
+        <w:numPr>
+          <w:ilvl w:val="0"/>
+          <w:numId w:val="46"/>
+        </w:numPr>
+        <w:spacing w:before="0" w:after="80" w:line="300" w:lineRule="auto"/>
+        <w:ind w:left="540" w:hanging="271"/>
+      </w:pPr>
+      <w:r>
+        <w:rPr>
+          <w:rFonts w:ascii="Calibri" w:hAnsi="Calibri"/>
+        </w:rPr>
+        <w:t xml:space="preserve">Cloudflare One DNS policies: </w:t>
+      </w:r>
+      <w:hyperlink r:id="rId35">
+        <w:r>
+          <w:rPr>
+            <w:color w:val="2E74B5"/>
+            <w:u w:val="single"/>
+          </w:rPr>
+          <w:t>https://developers.cloudflare.com/cloudflare-one/traffic-policies/dns-policies/</w:t>
         </w:r>
       </w:hyperlink>
     </w:p>
@@ -9108,6 +9611,24 @@
     </w:lvlOverride>
   </w:num>
   <w:num w:numId="43">
+    <w:abstractNumId w:val="9"/>
+    <w:lvlOverride w:ilvl="0">
+      <w:startOverride w:val="1"/>
+    </w:lvlOverride>
+  </w:num>
+  <w:num w:numId="44">
+    <w:abstractNumId w:val="9"/>
+    <w:lvlOverride w:ilvl="0">
+      <w:startOverride w:val="1"/>
+    </w:lvlOverride>
+  </w:num>
+  <w:num w:numId="45">
+    <w:abstractNumId w:val="9"/>
+    <w:lvlOverride w:ilvl="0">
+      <w:startOverride w:val="1"/>
+    </w:lvlOverride>
+  </w:num>
+  <w:num w:numId="46">
     <w:abstractNumId w:val="9"/>
     <w:lvlOverride w:ilvl="0">
       <w:startOverride w:val="1"/>

</xml_diff>

<commit_message>
docs(cloudflare): certify game security case study
</commit_message>
<xml_diff>
--- a/public/downloads/cloudflare-application-security-speaker-notes.docx
+++ b/public/downloads/cloudflare-application-security-speaker-notes.docx
@@ -8790,7 +8790,23 @@
         <w:rPr>
           <w:rFonts w:ascii="Calibri" w:hAnsi="Calibri"/>
         </w:rPr>
-        <w:t>The deterministic release contract passed 264 suites and 1,434 tests; the integrity scan covered 304 test files.</w:t>
+        <w:t>A 16-client production WebSocket soak delivered and acknowledged all 19,200 gameplay events with no errors or closes; observed round-trip latency was 43.8 ms p50 and 44.6 ms p95 from the test location.</w:t>
+      </w:r>
+    </w:p>
+    <w:p>
+      <w:pPr>
+        <w:numPr>
+          <w:ilvl w:val="0"/>
+          <w:numId w:val="44"/>
+        </w:numPr>
+        <w:spacing w:before="0" w:after="80" w:line="300" w:lineRule="auto"/>
+        <w:ind w:left="540" w:hanging="271"/>
+      </w:pPr>
+      <w:r>
+        <w:rPr>
+          <w:rFonts w:ascii="Calibri" w:hAnsi="Calibri"/>
+        </w:rPr>
+        <w:t>The deterministic release contract passed 282 suites and 1,545 tests. A 22-scenario physical-Chrome matrix covered eleven maps, three mobile profiles, five match modes, two quality extremes and third-person view; all scenarios passed at approximately 107–121 average FPS.</w:t>
       </w:r>
     </w:p>
     <w:p>
@@ -8818,6 +8834,46 @@
           <w:rFonts w:ascii="Calibri" w:hAnsi="Calibri"/>
         </w:rPr>
         <w:t>Do not overstate the result. One home-page p95 connection outlier remains, and the population RUM window is still accumulating. Deep health endpoint timings are control-plane diagnostics, not gameplay latency.</w:t>
+      </w:r>
+    </w:p>
+    <w:p>
+      <w:r>
+        <w:rPr>
+          <w:rFonts w:ascii="Calibri" w:hAnsi="Calibri"/>
+        </w:rPr>
+        <w:t>The final same-client gameplay comparison is also intentionally asymmetric:</w:t>
+      </w:r>
+    </w:p>
+    <w:p>
+      <w:r>
+        <w:rPr>
+          <w:rFonts w:ascii="Calibri" w:hAnsi="Calibri"/>
+        </w:rPr>
+        <w:t>Cloudflare Blocklands CTF reached the real scene at 120.17 FPS average,</w:t>
+      </w:r>
+    </w:p>
+    <w:p>
+      <w:r>
+        <w:rPr>
+          <w:rFonts w:ascii="Calibri" w:hAnsi="Calibri"/>
+        </w:rPr>
+        <w:t>107.10 FPS 1% low and 9.1 ms p95 with no failures. The legacy host did not</w:t>
+      </w:r>
+    </w:p>
+    <w:p>
+      <w:r>
+        <w:rPr>
+          <w:rFonts w:ascii="Calibri" w:hAnsi="Calibri"/>
+        </w:rPr>
+        <w:t>reach scene-ready and reported two renderer errors. Missing legacy FPS remains</w:t>
+      </w:r>
+    </w:p>
+    <w:p>
+      <w:r>
+        <w:rPr>
+          <w:rFonts w:ascii="Calibri" w:hAnsi="Calibri"/>
+        </w:rPr>
+        <w:t>unavailable; it is not converted into an improvement claim.</w:t>
       </w:r>
     </w:p>
     <w:p>
@@ -8839,7 +8895,7 @@
       <w:r>
         <w:drawing>
           <wp:inline xmlns:a="http://schemas.openxmlformats.org/drawingml/2006/main" xmlns:pic="http://schemas.openxmlformats.org/drawingml/2006/picture">
-            <wp:extent cx="5852160" cy="4401389"/>
+            <wp:extent cx="5852160" cy="4141529"/>
             <wp:docPr id="1" name="Picture 1"/>
             <wp:cNvGraphicFramePr>
               <a:graphicFrameLocks noChangeAspect="1"/>
@@ -8848,7 +8904,7 @@
               <a:graphicData uri="http://schemas.openxmlformats.org/drawingml/2006/picture">
                 <pic:pic>
                   <pic:nvPicPr>
-                    <pic:cNvPr id="0" name="cloudflare-fullstack-game-next-release.png"/>
+                    <pic:cNvPr id="0" name="cloudflare-game-complete-runtime-and-benchmark.png"/>
                     <pic:cNvPicPr/>
                   </pic:nvPicPr>
                   <pic:blipFill>
@@ -8860,7 +8916,7 @@
                   <pic:spPr>
                     <a:xfrm>
                       <a:off x="0" y="0"/>
-                      <a:ext cx="5852160" cy="4401389"/>
+                      <a:ext cx="5852160" cy="4141529"/>
                     </a:xfrm>
                     <a:prstGeom prst="rect"/>
                   </pic:spPr>
@@ -8883,7 +8939,7 @@
           <w:color w:val="66736A"/>
           <w:sz w:val="17"/>
         </w:rPr>
-        <w:t>QuakeCraft next-release full-stack Cloudflare architecture. The authoritative WebSocket room path is isolated from assets, durable records, AI/search, analytics, media and studio-only Zero Trust controls.</w:t>
+        <w:t>QuakeCraft complete Cloudflare runtime and evidence architecture. The authoritative WebSocket room path is isolated from assets, durable records, AI/search, analytics, media, release controls and benchmark evidence.</w:t>
       </w:r>
     </w:p>
     <w:p>
@@ -8892,6 +8948,14 @@
           <w:rFonts w:ascii="Calibri" w:hAnsi="Calibri"/>
         </w:rPr>
         <w:t>The hot path is deliberately small: browser, edge security/delivery, the dedicated multiplayer Worker and one room Durable Object. R2, KV, D1, Queues, Workers AI, Vectorize, AI Search, media services and Zero Trust policy cannot determine a hit, pickup, movement state, timer, arena revision or winner.</w:t>
+      </w:r>
+    </w:p>
+    <w:p>
+      <w:r>
+        <w:rPr>
+          <w:rFonts w:ascii="Calibri" w:hAnsi="Calibri"/>
+        </w:rPr>
+        <w:t>Workers KV is intentionally limited to the verified immutable asset-release pointer and other versioned, stale-safe defaults. Room settings, locks, counters, online state and per-tick bot decisions belong to the room Durable Object. Flagship is a future server-side-only option for reversible, non-authoritative visual, UX and telemetry rollouts; a browser provider would expose its API token and is therefore excluded. Containers are also excluded from gameplay and deployment because no current workload requires them and the account entitlement is not present.</w:t>
       </w:r>
     </w:p>
     <w:p>

</xml_diff>

<commit_message>
docs(cloudflare): document QuakeCraft FPS remediation
</commit_message>
<xml_diff>
--- a/public/downloads/cloudflare-application-security-speaker-notes.docx
+++ b/public/downloads/cloudflare-application-security-speaker-notes.docx
@@ -65,6 +65,9 @@
         <w:gridCol w:w="2340"/>
       </w:tblGrid>
       <w:tr>
+        <w:trPr>
+          <w:tblHeader w:val="true"/>
+        </w:trPr>
         <w:tc>
           <w:tcPr>
             <w:tcW w:type="dxa" w:w="2340"/>
@@ -8774,7 +8777,7 @@
         <w:rPr>
           <w:rFonts w:ascii="Calibri" w:hAnsi="Calibri"/>
         </w:rPr>
-        <w:t>The final live gates passed: 60/60 OWASP-aligned probes, 1/1 two-human state convergence, 2/2 mobile landscape engines, 3/3 regional HTTPS/TLS checks, and a six-minute production tournament with seven bots, 70 bot-on-bot attacks and 11 frags.</w:t>
+        <w:t>The final live gates passed: 60/60 OWASP-aligned probes, 1/1 two-human state convergence, 2/2 mobile landscape engines, 3/3 regional HTTPS/TLS checks, and a six-minute production tournament in which all ten bots moved, produced 1,723 target intents, 176 shots, 88 attacks, 20 frags, 18 deaths, 295 cover hits, construction and material-aware destruction.</w:t>
       </w:r>
     </w:p>
     <w:p>
@@ -8790,7 +8793,7 @@
         <w:rPr>
           <w:rFonts w:ascii="Calibri" w:hAnsi="Calibri"/>
         </w:rPr>
-        <w:t>A 16-client production WebSocket soak delivered and acknowledged all 19,200 gameplay events with no errors or closes; observed round-trip latency was 43.8 ms p50 and 44.6 ms p95 from the test location.</w:t>
+        <w:t>A 16-client production WebSocket soak acknowledged all 1,200 client sends and delivered all 19,200 broadcasts with no errors or closes; observed round-trip latency was 50.8 ms p50, 59.4 ms p95 and 59.5 ms maximum from the test location.</w:t>
       </w:r>
     </w:p>
     <w:p>
@@ -8806,7 +8809,7 @@
         <w:rPr>
           <w:rFonts w:ascii="Calibri" w:hAnsi="Calibri"/>
         </w:rPr>
-        <w:t>The deterministic release contract passed 282 suites and 1,545 tests. A 22-scenario physical-Chrome matrix covered eleven maps, three mobile profiles, five match modes, two quality extremes and third-person view; all scenarios passed at approximately 107–121 average FPS.</w:t>
+        <w:t>The deterministic release contract passed 284 suites and 1,560 tests; its integrity scan covered 328 test files. A retained 22-scenario physical-Chrome matrix covered eleven maps, three mobile profiles, five match modes, two quality extremes and third-person view; all scenarios passed at approximately 107–121 average FPS.</w:t>
       </w:r>
     </w:p>
     <w:p>
@@ -8896,7 +8899,7 @@
         <w:drawing>
           <wp:inline xmlns:a="http://schemas.openxmlformats.org/drawingml/2006/main" xmlns:pic="http://schemas.openxmlformats.org/drawingml/2006/picture">
             <wp:extent cx="5852160" cy="4141529"/>
-            <wp:docPr id="1" name="Picture 1"/>
+            <wp:docPr id="1" name="Picture 1" title="QuakeCraft Cloudflare runtime architecture" descr="Cloudflare edge, authoritative match, asynchronous services, security, observability and benchmark boundaries."/>
             <wp:cNvGraphicFramePr>
               <a:graphicFrameLocks noChangeAspect="1"/>
             </wp:cNvGraphicFramePr>
@@ -8955,7 +8958,7 @@
         <w:rPr>
           <w:rFonts w:ascii="Calibri" w:hAnsi="Calibri"/>
         </w:rPr>
-        <w:t>Workers KV is intentionally limited to the verified immutable asset-release pointer and other versioned, stale-safe defaults. Room settings, locks, counters, online state and per-tick bot decisions belong to the room Durable Object. Flagship is a future server-side-only option for reversible, non-authoritative visual, UX and telemetry rollouts; a browser provider would expose its API token and is therefore excluded. Containers are also excluded from gameplay and deployment because no current workload requires them and the account entitlement is not present.</w:t>
+        <w:t>Workers KV is intentionally limited to the verified immutable asset-release pointer and other versioned, stale-safe defaults. Room settings, locks, counters, online state and per-tick bot decisions belong to the room Durable Object. Flagship is active through a server-side Worker binding for only non-authoritative telemetry sampling and development-only PlatPhorm tracing; no browser token or match authority is exposed. Containers remain excluded because no current workload or account entitlement justifies them.</w:t>
       </w:r>
     </w:p>
     <w:p>
@@ -9031,6 +9034,34 @@
           <w:rFonts w:ascii="Calibri" w:hAnsi="Calibri"/>
         </w:rPr>
         <w:t>Cloudflare One DNS policies protect enrolled studio and CI device egress only. They do not replace public authoritative DNS, CDN routing or player-path controls and require a canary plus policy-precedence audit before enablement.</w:t>
+      </w:r>
+    </w:p>
+    <w:p>
+      <w:pPr>
+        <w:pStyle w:val="Heading2"/>
+      </w:pPr>
+      <w:r>
+        <w:t>July 28 performance incident and exact-source remediation</w:t>
+      </w:r>
+    </w:p>
+    <w:p>
+      <w:r>
+        <w:t>A July 28 report of roughly 5 FPS was reproduced as a client-host and renderer provenance incident, not attributed to the Cloudflare edge. A stale six-hour SwiftShader automation browser, active memory compression and swap, two live WebGL arenas, and unrelated high-CPU desktop processes were present. After terminating only that stale test browser, constrained physical Apple M2 Pro samples measured 40.14 FPS on the legacy Mansion CTF room and 40.97 FPS on the Cloudflare room.</w:t>
+      </w:r>
+    </w:p>
+    <w:p>
+      <w:r>
+        <w:t>The same Cloudflare snapshot exposed a real game defect: five Mansion bots accumulated 119 stuck-recovery impulses while holding valid combat targets. Hotfix commit cb6256fa preserves valid combat holds and limits recovery to one impulse per bot per five seconds. Application Worker version 179f6a71-cc1d-4602-9ceb-58e18485ce77 is the retained first-deployment receipt; /api/version identifies the current exact source.</w:t>
+      </w:r>
+    </w:p>
+    <w:p>
+      <w:r>
+        <w:t>A separate 22-scenario SwiftShader matrix remains retained as an explicit failure: three scenes did not become ready, measured FPS ranged from 0.31 to 15.65, and the artifact states that the physical-GPU performance contract was not measured. Software-rendered automation cannot replace the clean hardware-backed release gate.</w:t>
+      </w:r>
+    </w:p>
+    <w:p>
+      <w:r>
+        <w:t>Log Explorer triage must filter canonical host traffic by request source. Early Hints cache lookups are not player responses, while common .env probes terminate at the WAF with 403. The experimental brayden/pubsub starter is not in the authoritative match path because authentication, ordering, retries, QoS, sharding, replay and deduplication remain unresolved.</w:t>
       </w:r>
     </w:p>
     <w:p>

</xml_diff>

<commit_message>
docs: update Cloudflare game security case study
</commit_message>
<xml_diff>
--- a/public/downloads/cloudflare-application-security-speaker-notes.docx
+++ b/public/downloads/cloudflare-application-security-speaker-notes.docx
@@ -9042,6 +9042,31 @@
       </w:pPr>
       <w:r>
         <w:t>July 28 performance incident and exact-source remediation</w:t>
+      </w:r>
+    </w:p>
+    <w:p>
+      <w:r>
+        <w:t>The July 28 Enterprise checkpoint preserves the migration journey instead of rewriting it. The zone is verified as an active Enterprise Website plan, but entitlement is not treated as proof that an Enterprise feature or rule is configured. The retained before/after diagrams remain historical evidence, while the new dated architecture diagram records the current player, edge, authoritative-match, asynchronous-service, security, observability and release-gate boundaries.</w:t>
+      </w:r>
+    </w:p>
+    <w:p>
+      <w:r>
+        <w:t>Current gameplay authority is deliberately narrow: Cloudflare routes a room WebSocket to one room-scoped Durable Object, which owns roster order, host settings, movement envelopes, pickup and objective revisions, match score, chat ordering and reconnect continuity. R2 and the CDN deliver immutable assets; KV holds stale-safe release pointers; D1, Queues, Pipelines, Workers AI, Analytics Engine, R2 Data Catalog, Stream, Calls and search services are asynchronous or opt-in and never participate in the tick, hit or ordered state hot path.</w:t>
+      </w:r>
+    </w:p>
+    <w:p>
+      <w:r>
+        <w:t>Fresh Apple M2 Pro hardware evidence using ANGLE Metal measured 118.0 to 119.6 average FPS, 51.37 to 61.79 FPS at the 1% low, 9.3 to 9.6 milliseconds p95 frame time and 3.61 milliseconds GPU time in the Cloudflare CTF scene. The same diagnostic recorded 475 draw calls, 481,364 triangles, 243 geometries, 34 textures and 70 programs. A separate SwiftShader run at approximately 6.7 FPS remains labeled functional software-renderer evidence, not a gameplay performance result.</w:t>
+      </w:r>
+    </w:p>
+    <w:p>
+      <w:r>
+        <w:t>A short two-human canary authority test passed both clients in 3.2 seconds: the humans shared an ordered room, host-owned settings won, movement, pickup and chat converged, guest CTF writes were rejected, a host objective revision was accepted, a stale revision was rejected and both clients read the same score and objective state. A local carrier-routing safeguard now preserves a bot flag carrier's capture objective while retaining combat retaliation for non-carriers; it remains a candidate until build, canary deployment and live CTF gates pass.</w:t>
+      </w:r>
+    </w:p>
+    <w:p>
+      <w:r>
+        <w:t>Cloudflare credential governance follows least privilege and separation of duties. A 30-day account deployment policy grants write access only to the game delivery, data, AI, media, observability and account security services needed for this release, while logs, analytics, security reports, request tracing and posture inspection remain read-only. It excludes billing, membership, token-management and unrestricted account-settings writes. Zone DNS, cache, WAF and rate-limit mutations require a separate token limited to innovativefuturesolutions.com; credentials never enter source, public documents, traces, screenshots or browser bundles.</w:t>
       </w:r>
     </w:p>
     <w:p>

</xml_diff>